<commit_message>
Use portable coordinate restriction notation in research PDF
</commit_message>
<xml_diff>
--- a/manuscript/SG_DIFRA_EUROCRYPT_2028_RESEARCH_DRAFT.docx
+++ b/manuscript/SG_DIFRA_EUROCRYPT_2028_RESEARCH_DRAFT.docx
@@ -46820,16 +46820,10 @@
                     <m:grow/>
                   </m:dPr>
                   <m:e>
-                    <m:r>
-                      <m:t>x</m:t>
-                    </m:r>
                     <m:sSub>
                       <m:e>
                         <m:r>
-                          <m:rPr>
-                            <m:sty m:val="p"/>
-                          </m:rPr>
-                          <m:t>|</m:t>
+                          <m:t>x</m:t>
                         </m:r>
                       </m:e>
                       <m:sub>
@@ -46874,7 +46868,59 @@
         </m:sSubSup>
       </m:oMath>
       <w:r>
-        <w:t xml:space="preserve">, with complete public local ternary function tables and public scopes. Write</w:t>
+        <w:t xml:space="preserve">, where</w:t>
+      </w:r>
+      <w:r>
+        <w:t xml:space="preserve"> </w:t>
+      </w:r>
+      <m:oMath>
+        <m:sSub>
+          <m:e>
+            <m:r>
+              <m:t>x</m:t>
+            </m:r>
+          </m:e>
+          <m:sub>
+            <m:sSub>
+              <m:e>
+                <m:r>
+                  <m:t>S</m:t>
+                </m:r>
+              </m:e>
+              <m:sub>
+                <m:r>
+                  <m:t>i</m:t>
+                </m:r>
+              </m:sub>
+            </m:sSub>
+          </m:sub>
+        </m:sSub>
+      </m:oMath>
+      <w:r>
+        <w:t xml:space="preserve"> </w:t>
+      </w:r>
+      <w:r>
+        <w:t xml:space="preserve">denotes restriction to the public coordinate scope</w:t>
+      </w:r>
+      <w:r>
+        <w:t xml:space="preserve"> </w:t>
+      </w:r>
+      <m:oMath>
+        <m:sSub>
+          <m:e>
+            <m:r>
+              <m:t>S</m:t>
+            </m:r>
+          </m:e>
+          <m:sub>
+            <m:r>
+              <m:t>i</m:t>
+            </m:r>
+          </m:sub>
+        </m:sSub>
+      </m:oMath>
+      <w:r>
+        <w:t xml:space="preserve">, and assume complete public local ternary function tables. Write</w:t>
       </w:r>
       <w:r>
         <w:t xml:space="preserve"> </w:t>
@@ -47089,16 +47135,10 @@
             </m:rPr>
             <m:t>:</m:t>
           </m:r>
-          <m:r>
-            <m:t>h</m:t>
-          </m:r>
           <m:sSub>
             <m:e>
               <m:r>
-                <m:rPr>
-                  <m:sty m:val="p"/>
-                </m:rPr>
-                <m:t>|</m:t>
+                <m:t>h</m:t>
               </m:r>
             </m:e>
             <m:sub>
@@ -47220,16 +47260,10 @@
                       <m:grow/>
                     </m:dPr>
                     <m:e>
-                      <m:r>
-                        <m:t>h</m:t>
-                      </m:r>
                       <m:sSub>
                         <m:e>
                           <m:r>
-                            <m:rPr>
-                              <m:sty m:val="p"/>
-                            </m:rPr>
-                            <m:t>|</m:t>
+                            <m:t>h</m:t>
                           </m:r>
                         </m:e>
                         <m:sub>

</xml_diff>

<commit_message>
Preserve linear-map image meaning in published theorem
</commit_message>
<xml_diff>
--- a/manuscript/SG_DIFRA_EUROCRYPT_2028_RESEARCH_DRAFT.docx
+++ b/manuscript/SG_DIFRA_EUROCRYPT_2028_RESEARCH_DRAFT.docx
@@ -47362,7 +47362,7 @@
         <w:t xml:space="preserve"> </w:t>
       </w:r>
       <w:r>
-        <w:t xml:space="preserve">with</w:t>
+        <w:t xml:space="preserve">for which</w:t>
       </w:r>
       <w:r>
         <w:t xml:space="preserve"> </w:t>
@@ -47393,18 +47393,17 @@
             </m:r>
           </m:e>
         </m:d>
-        <m:r>
-          <m:rPr>
-            <m:sty m:val="p"/>
-          </m:rPr>
-          <m:t>∈</m:t>
-        </m:r>
-        <m:r>
-          <m:rPr>
-            <m:sty m:val="p"/>
-          </m:rPr>
-          <m:t>im</m:t>
-        </m:r>
+      </m:oMath>
+      <w:r>
+        <w:t xml:space="preserve"> </w:t>
+      </w:r>
+      <w:r>
+        <w:t xml:space="preserve">belongs to the image of</w:t>
+      </w:r>
+      <w:r>
+        <w:t xml:space="preserve"> </w:t>
+      </w:r>
+      <m:oMath>
         <m:r>
           <m:t>Γ</m:t>
         </m:r>

</xml_diff>